<commit_message>
fix: optimizacion y agregacion de requerimientos
</commit_message>
<xml_diff>
--- a/docs/Requerimientos Proyecto Gestion De Eventos.docx
+++ b/docs/Requerimientos Proyecto Gestion De Eventos.docx
@@ -4,6 +4,7 @@
   <w:body>
     <w:p>
       <w:pPr>
+        <w:ind w:firstLine="720"/>
         <w:jc w:val="center"/>
         <w:rPr>
           <w:lang w:val="es-CO"/>
@@ -103,11 +104,24 @@
             <w:tcW w:w="5669" w:type="dxa"/>
           </w:tcPr>
           <w:p>
+            <w:pPr>
+              <w:tabs>
+                <w:tab w:val="left" w:pos="1970"/>
+              </w:tabs>
+            </w:pPr>
+            <w:proofErr w:type="spellStart"/>
             <w:r>
               <w:rPr>
                 <w:b/>
               </w:rPr>
               <w:t>Descripción</w:t>
+            </w:r>
+            <w:proofErr w:type="spellEnd"/>
+            <w:r>
+              <w:rPr>
+                <w:b/>
+              </w:rPr>
+              <w:tab/>
             </w:r>
           </w:p>
         </w:tc>
@@ -153,13 +167,19 @@
               <w:rPr>
                 <w:lang w:val="es-CO"/>
               </w:rPr>
-              <w:t xml:space="preserve">El sistema deberá permitir registrar y consultar clientes, </w:t>
+              <w:t>El sistema deberá permitir registrar y consultar clientes, incluyendo personas naturales, personas jurídicas</w:t>
             </w:r>
             <w:r>
               <w:rPr>
                 <w:lang w:val="es-CO"/>
               </w:rPr>
-              <w:t>incluyendo personas naturales, personas jurídicas e instituciones.</w:t>
+              <w:t>, empresas</w:t>
+            </w:r>
+            <w:r>
+              <w:rPr>
+                <w:lang w:val="es-CO"/>
+              </w:rPr>
+              <w:t xml:space="preserve"> e instituciones.</w:t>
             </w:r>
           </w:p>
         </w:tc>
@@ -175,53 +195,10 @@
           </w:tcPr>
           <w:p>
             <w:r>
-              <w:t>RF-02</w:t>
+              <w:t>RF-0</w:t>
             </w:r>
-          </w:p>
-        </w:tc>
-        <w:tc>
-          <w:tcPr>
-            <w:tcW w:w="2835" w:type="dxa"/>
-            <w:vAlign w:val="center"/>
-          </w:tcPr>
-          <w:p>
             <w:r>
-              <w:t>Gestionar empresas</w:t>
-            </w:r>
-          </w:p>
-        </w:tc>
-        <w:tc>
-          <w:tcPr>
-            <w:tcW w:w="5669" w:type="dxa"/>
-            <w:vAlign w:val="center"/>
-          </w:tcPr>
-          <w:p>
-            <w:pPr>
-              <w:rPr>
-                <w:lang w:val="es-CO"/>
-              </w:rPr>
-            </w:pPr>
-            <w:r>
-              <w:rPr>
-                <w:lang w:val="es-CO"/>
-              </w:rPr>
-              <w:t>El sistema deberá permitir registrar, consultar y parametrizar la información de las empresas, incluyendo razón social, identificación, contacto y ciudad.</w:t>
-            </w:r>
-          </w:p>
-        </w:tc>
-      </w:tr>
-      <w:tr>
-        <w:trPr>
-          <w:jc w:val="center"/>
-        </w:trPr>
-        <w:tc>
-          <w:tcPr>
-            <w:tcW w:w="1134" w:type="dxa"/>
-            <w:vAlign w:val="center"/>
-          </w:tcPr>
-          <w:p>
-            <w:r>
-              <w:t>RF-03</w:t>
+              <w:t>2</w:t>
             </w:r>
           </w:p>
         </w:tc>
@@ -267,7 +244,10 @@
           </w:tcPr>
           <w:p>
             <w:r>
-              <w:t>RF-04</w:t>
+              <w:t>RF-0</w:t>
+            </w:r>
+            <w:r>
+              <w:t>3</w:t>
             </w:r>
           </w:p>
         </w:tc>
@@ -297,13 +277,7 @@
               <w:rPr>
                 <w:lang w:val="es-CO"/>
               </w:rPr>
-              <w:t>El sistema deberá permitir configurar los tipos de montaje dispo</w:t>
-            </w:r>
-            <w:r>
-              <w:rPr>
-                <w:lang w:val="es-CO"/>
-              </w:rPr>
-              <w:t>nibles para los eventos y sus respectivas capacidades.</w:t>
+              <w:t>El sistema deberá permitir configurar los tipos de montaje disponibles para los eventos y sus respectivas capacidades.</w:t>
             </w:r>
           </w:p>
         </w:tc>
@@ -319,7 +293,10 @@
           </w:tcPr>
           <w:p>
             <w:r>
-              <w:t>RF-05</w:t>
+              <w:t>RF-0</w:t>
+            </w:r>
+            <w:r>
+              <w:t>4</w:t>
             </w:r>
           </w:p>
         </w:tc>
@@ -365,7 +342,10 @@
           </w:tcPr>
           <w:p>
             <w:r>
-              <w:t>RF-06</w:t>
+              <w:t>RF-0</w:t>
+            </w:r>
+            <w:r>
+              <w:t>5</w:t>
             </w:r>
           </w:p>
         </w:tc>
@@ -376,10 +356,7 @@
           </w:tcPr>
           <w:p>
             <w:r>
-              <w:t>Gestionar concepto</w:t>
-            </w:r>
-            <w:r>
-              <w:t>s y precios</w:t>
+              <w:t>Gestionar conceptos y precios</w:t>
             </w:r>
           </w:p>
         </w:tc>
@@ -414,7 +391,10 @@
           </w:tcPr>
           <w:p>
             <w:r>
-              <w:t>RF-07</w:t>
+              <w:t>RF-0</w:t>
+            </w:r>
+            <w:r>
+              <w:t>6</w:t>
             </w:r>
           </w:p>
         </w:tc>
@@ -444,13 +424,7 @@
               <w:rPr>
                 <w:lang w:val="es-CO"/>
               </w:rPr>
-              <w:t>El sistema deberá permitir generar cotizaciones considerando salón, montaje,</w:t>
-            </w:r>
-            <w:r>
-              <w:rPr>
-                <w:lang w:val="es-CO"/>
-              </w:rPr>
-              <w:t xml:space="preserve"> cantidad de personas, duración, productos, servicios, precios e impuestos.</w:t>
+              <w:t>El sistema deberá permitir generar cotizaciones considerando salón, montaje, cantidad de personas, duración, productos, servicios, precios e impuestos.</w:t>
             </w:r>
           </w:p>
         </w:tc>
@@ -466,7 +440,10 @@
           </w:tcPr>
           <w:p>
             <w:r>
-              <w:t>RF-08</w:t>
+              <w:t>RF-0</w:t>
+            </w:r>
+            <w:r>
+              <w:t>7</w:t>
             </w:r>
           </w:p>
         </w:tc>
@@ -512,7 +489,10 @@
           </w:tcPr>
           <w:p>
             <w:r>
-              <w:t>RF-09</w:t>
+              <w:t>RF-0</w:t>
+            </w:r>
+            <w:r>
+              <w:t>8</w:t>
             </w:r>
           </w:p>
         </w:tc>
@@ -523,10 +503,7 @@
           </w:tcPr>
           <w:p>
             <w:r>
-              <w:t xml:space="preserve">Registrar </w:t>
-            </w:r>
-            <w:r>
-              <w:t>aceptación y garantía</w:t>
+              <w:t>Registrar aceptación y garantía</w:t>
             </w:r>
           </w:p>
         </w:tc>
@@ -561,7 +538,10 @@
           </w:tcPr>
           <w:p>
             <w:r>
-              <w:t>RF-10</w:t>
+              <w:t>RF-</w:t>
+            </w:r>
+            <w:r>
+              <w:t>09</w:t>
             </w:r>
           </w:p>
         </w:tc>
@@ -591,13 +571,7 @@
               <w:rPr>
                 <w:lang w:val="es-CO"/>
               </w:rPr>
-              <w:t>El sistema deberá permitir confirmar un evento cuando se hayan cumplido las condi</w:t>
-            </w:r>
-            <w:r>
-              <w:rPr>
-                <w:lang w:val="es-CO"/>
-              </w:rPr>
-              <w:t>ciones de garantía establecidas.</w:t>
+              <w:t>El sistema deberá permitir confirmar un evento cuando se hayan cumplido las condiciones de garantía establecidas.</w:t>
             </w:r>
           </w:p>
         </w:tc>
@@ -613,7 +587,10 @@
           </w:tcPr>
           <w:p>
             <w:r>
-              <w:t>RF-11</w:t>
+              <w:t>RF-1</w:t>
+            </w:r>
+            <w:r>
+              <w:t>0</w:t>
             </w:r>
           </w:p>
         </w:tc>
@@ -659,7 +636,10 @@
           </w:tcPr>
           <w:p>
             <w:r>
-              <w:t>RF-12</w:t>
+              <w:t>RF-1</w:t>
+            </w:r>
+            <w:r>
+              <w:t>1</w:t>
             </w:r>
           </w:p>
         </w:tc>
@@ -689,13 +669,123 @@
               <w:rPr>
                 <w:lang w:val="es-CO"/>
               </w:rPr>
-              <w:t>El sistema deberá conservar y permitir consulta</w:t>
+              <w:t>El sistema deberá conservar y permitir consultar la información de eventos confirmados, cancelados y finalizados.</w:t>
+            </w:r>
+          </w:p>
+        </w:tc>
+      </w:tr>
+      <w:tr>
+        <w:trPr>
+          <w:jc w:val="center"/>
+        </w:trPr>
+        <w:tc>
+          <w:tcPr>
+            <w:tcW w:w="1134" w:type="dxa"/>
+            <w:vAlign w:val="center"/>
+          </w:tcPr>
+          <w:p>
+            <w:r>
+              <w:t>RF-12</w:t>
+            </w:r>
+          </w:p>
+        </w:tc>
+        <w:tc>
+          <w:tcPr>
+            <w:tcW w:w="2835" w:type="dxa"/>
+            <w:vAlign w:val="center"/>
+          </w:tcPr>
+          <w:p>
+            <w:r>
+              <w:t>Gestionar Proveedores</w:t>
+            </w:r>
+          </w:p>
+        </w:tc>
+        <w:tc>
+          <w:tcPr>
+            <w:tcW w:w="5669" w:type="dxa"/>
+            <w:vAlign w:val="center"/>
+          </w:tcPr>
+          <w:p>
+            <w:pPr>
+              <w:rPr>
+                <w:lang w:val="es-CO"/>
+              </w:rPr>
+            </w:pPr>
+            <w:r>
+              <w:rPr>
+                <w:lang w:val="es-CO"/>
+              </w:rPr>
+              <w:t>El sistema deberá permitir registrar provee</w:t>
             </w:r>
             <w:r>
               <w:rPr>
                 <w:lang w:val="es-CO"/>
               </w:rPr>
-              <w:t>r la información de eventos confirmados, cancelados y finalizados.</w:t>
+              <w:t>dores junto con sus montajes</w:t>
+            </w:r>
+          </w:p>
+        </w:tc>
+      </w:tr>
+      <w:tr>
+        <w:trPr>
+          <w:jc w:val="center"/>
+        </w:trPr>
+        <w:tc>
+          <w:tcPr>
+            <w:tcW w:w="1134" w:type="dxa"/>
+            <w:vAlign w:val="center"/>
+          </w:tcPr>
+          <w:p>
+            <w:r>
+              <w:t>RF-13</w:t>
+            </w:r>
+          </w:p>
+        </w:tc>
+        <w:tc>
+          <w:tcPr>
+            <w:tcW w:w="2835" w:type="dxa"/>
+            <w:vAlign w:val="center"/>
+          </w:tcPr>
+          <w:p>
+            <w:r>
+              <w:t>Recuperacion de Contraseña</w:t>
+            </w:r>
+          </w:p>
+        </w:tc>
+        <w:tc>
+          <w:tcPr>
+            <w:tcW w:w="5669" w:type="dxa"/>
+            <w:vAlign w:val="center"/>
+          </w:tcPr>
+          <w:p>
+            <w:pPr>
+              <w:rPr>
+                <w:lang w:val="es-CO"/>
+              </w:rPr>
+            </w:pPr>
+            <w:r>
+              <w:rPr>
+                <w:lang w:val="es-CO"/>
+              </w:rPr>
+              <w:t xml:space="preserve">El sistema </w:t>
+            </w:r>
+            <w:r>
+              <w:rPr>
+                <w:lang w:val="es-CO"/>
+              </w:rPr>
+              <w:t>deberá</w:t>
+            </w:r>
+            <w:r>
+              <w:rPr>
+                <w:lang w:val="es-CO"/>
+              </w:rPr>
+              <w:t xml:space="preserve"> enviar un código al </w:t>
+            </w:r>
+            <w:r>
+              <w:rPr>
+                <w:lang w:val="es-CO"/>
+              </w:rPr>
+              <w:t>correo registrado para restablecer la contraseña</w:t>
             </w:r>
           </w:p>
         </w:tc>
@@ -727,7 +817,7 @@
       <w:tblGrid>
         <w:gridCol w:w="1134"/>
         <w:gridCol w:w="2835"/>
-        <w:gridCol w:w="5669"/>
+        <w:gridCol w:w="5503"/>
       </w:tblGrid>
       <w:tr>
         <w:trPr>
@@ -761,7 +851,7 @@
         </w:tc>
         <w:tc>
           <w:tcPr>
-            <w:tcW w:w="5669" w:type="dxa"/>
+            <w:tcW w:w="5503" w:type="dxa"/>
           </w:tcPr>
           <w:p>
             <w:r>
@@ -801,7 +891,7 @@
         </w:tc>
         <w:tc>
           <w:tcPr>
-            <w:tcW w:w="5669" w:type="dxa"/>
+            <w:tcW w:w="5503" w:type="dxa"/>
             <w:vAlign w:val="center"/>
           </w:tcPr>
           <w:p>
@@ -814,13 +904,7 @@
               <w:rPr>
                 <w:lang w:val="es-CO"/>
               </w:rPr>
-              <w:t xml:space="preserve">La interfaz deberá ser clara, sencilla y facilitar la consulta de disponibilidad y la generación de </w:t>
-            </w:r>
-            <w:r>
-              <w:rPr>
-                <w:lang w:val="es-CO"/>
-              </w:rPr>
-              <w:t>cotizaciones.</w:t>
+              <w:t>La interfaz deberá ser clara, sencilla y facilitar la consulta de disponibilidad y la generación de cotizaciones.</w:t>
             </w:r>
           </w:p>
         </w:tc>
@@ -853,7 +937,7 @@
         </w:tc>
         <w:tc>
           <w:tcPr>
-            <w:tcW w:w="5669" w:type="dxa"/>
+            <w:tcW w:w="5503" w:type="dxa"/>
             <w:vAlign w:val="center"/>
           </w:tcPr>
           <w:p>
@@ -899,7 +983,7 @@
         </w:tc>
         <w:tc>
           <w:tcPr>
-            <w:tcW w:w="5669" w:type="dxa"/>
+            <w:tcW w:w="5503" w:type="dxa"/>
             <w:vAlign w:val="center"/>
           </w:tcPr>
           <w:p>
@@ -912,13 +996,7 @@
               <w:rPr>
                 <w:lang w:val="es-CO"/>
               </w:rPr>
-              <w:t>El sistema deberá conservar información sobre el usuario, fecha y acción realizada en operaciones</w:t>
-            </w:r>
-            <w:r>
-              <w:rPr>
-                <w:lang w:val="es-CO"/>
-              </w:rPr>
-              <w:t xml:space="preserve"> relevantes como bloqueos, cambios, confirmaciones y cancelaciones.</w:t>
+              <w:t>El sistema deberá conservar información sobre el usuario, fecha y acción realizada en operaciones relevantes como bloqueos, cambios, confirmaciones y cancelaciones.</w:t>
             </w:r>
           </w:p>
         </w:tc>
@@ -934,6 +1012,7 @@
           </w:tcPr>
           <w:p>
             <w:r>
+              <w:lastRenderedPageBreak/>
               <w:t>RNF-04</w:t>
             </w:r>
           </w:p>
@@ -951,7 +1030,7 @@
         </w:tc>
         <w:tc>
           <w:tcPr>
-            <w:tcW w:w="5669" w:type="dxa"/>
+            <w:tcW w:w="5503" w:type="dxa"/>
             <w:vAlign w:val="center"/>
           </w:tcPr>
           <w:p>
@@ -997,7 +1076,7 @@
         </w:tc>
         <w:tc>
           <w:tcPr>
-            <w:tcW w:w="5669" w:type="dxa"/>
+            <w:tcW w:w="5503" w:type="dxa"/>
             <w:vAlign w:val="center"/>
           </w:tcPr>
           <w:p>
@@ -1010,20 +1089,7 @@
               <w:rPr>
                 <w:lang w:val="es-CO"/>
               </w:rPr>
-              <w:t xml:space="preserve">Las </w:t>
-            </w:r>
-            <w:r>
-              <w:rPr>
-                <w:lang w:val="es-CO"/>
-              </w:rPr>
-              <w:t xml:space="preserve">consultas de disponibilidad y la generación de </w:t>
-            </w:r>
-            <w:r>
-              <w:rPr>
-                <w:lang w:val="es-CO"/>
-              </w:rPr>
-              <w:lastRenderedPageBreak/>
-              <w:t>cotizaciones deberán responder en tiempos adecuados para la operación.</w:t>
+              <w:t>Las consultas de disponibilidad y la generación de cotizaciones deberán responder en tiempos adecuados para la operación.</w:t>
             </w:r>
           </w:p>
         </w:tc>
@@ -1039,7 +1105,6 @@
           </w:tcPr>
           <w:p>
             <w:r>
-              <w:lastRenderedPageBreak/>
               <w:t>RNF-06</w:t>
             </w:r>
           </w:p>
@@ -1057,7 +1122,7 @@
         </w:tc>
         <w:tc>
           <w:tcPr>
-            <w:tcW w:w="5669" w:type="dxa"/>
+            <w:tcW w:w="5503" w:type="dxa"/>
             <w:vAlign w:val="center"/>
           </w:tcPr>
           <w:p>
@@ -1103,7 +1168,7 @@
         </w:tc>
         <w:tc>
           <w:tcPr>
-            <w:tcW w:w="5669" w:type="dxa"/>
+            <w:tcW w:w="5503" w:type="dxa"/>
             <w:vAlign w:val="center"/>
           </w:tcPr>
           <w:p>
@@ -1149,7 +1214,7 @@
         </w:tc>
         <w:tc>
           <w:tcPr>
-            <w:tcW w:w="5669" w:type="dxa"/>
+            <w:tcW w:w="5503" w:type="dxa"/>
             <w:vAlign w:val="center"/>
           </w:tcPr>
           <w:p>
@@ -1162,13 +1227,7 @@
               <w:rPr>
                 <w:lang w:val="es-CO"/>
               </w:rPr>
-              <w:t>El sistema deberá mantener la coherencia de la información y evitar inconsistencias entre los estado</w:t>
-            </w:r>
-            <w:r>
-              <w:rPr>
-                <w:lang w:val="es-CO"/>
-              </w:rPr>
-              <w:t>s y movimientos de los eventos.</w:t>
+              <w:t>El sistema deberá mantener la coherencia de la información y evitar inconsistencias entre los estados y movimientos de los eventos.</w:t>
             </w:r>
           </w:p>
         </w:tc>
@@ -1679,11 +1738,6 @@
     <w:lsdException w:name="Book Title" w:uiPriority="33" w:qFormat="1"/>
     <w:lsdException w:name="Bibliography" w:semiHidden="1" w:uiPriority="37" w:unhideWhenUsed="1"/>
     <w:lsdException w:name="TOC Heading" w:semiHidden="1" w:uiPriority="39" w:unhideWhenUsed="1" w:qFormat="1"/>
-    <w:lsdException w:name="Plain Table 5" w:semiHidden="1" w:unhideWhenUsed="1"/>
-    <w:lsdException w:name="Grid Table Light" w:semiHidden="1" w:unhideWhenUsed="1"/>
-    <w:lsdException w:name="Grid Table 1 Light" w:semiHidden="1" w:unhideWhenUsed="1"/>
-    <w:lsdException w:name="Grid Table 2" w:semiHidden="1" w:unhideWhenUsed="1"/>
-    <w:lsdException w:name="Grid Table 3" w:semiHidden="1" w:unhideWhenUsed="1"/>
     <w:lsdException w:name="Grid Table 4" w:uiPriority="49"/>
     <w:lsdException w:name="Grid Table 5 Dark" w:uiPriority="50"/>
     <w:lsdException w:name="Grid Table 6 Colorful" w:uiPriority="51"/>

</xml_diff>